<commit_message>
Audit and harden EvoForecast scrollytelling
</commit_message>
<xml_diff>
--- a/EvoForecast-decision-brief.docx
+++ b/EvoForecast-decision-brief.docx
@@ -73,7 +73,7 @@
           <w:sz w:val="40"/>
           <w:szCs w:val="40"/>
         </w:rPr>
-        <w:t xml:space="preserve">Rehearse the experiment before you fund it</w:t>
+        <w:t>Rehearse the experiment before you commit to it</w:t>
       </w:r>
     </w:p>
     <w:p>
@@ -237,6 +237,7 @@
     </w:p>
     <w:p>
       <w:pPr>
+        <w:keepNext/>
         <w:pBdr>
           <w:top w:val="single" w:color="D7DEE2" w:sz="6" w:space="6"/>
         </w:pBdr>
@@ -265,11 +266,12 @@
           <w:sz w:val="19"/>
           <w:szCs w:val="19"/>
         </w:rPr>
-        <w:t xml:space="preserve">A programme can buy more sequencing, more time points, and more replicates, and still be unable to say which forecasting design is better. Averages hide the failure that matters. A model can post a strong mean error and still miss often enough that anyone acting on it is wrong at the moment of decision. By the time field data arrive, tens of millions of dollars are committed and the comparison is no longer available to make. This is a design problem, and it is cheapest to solve before anyone collects a sample.</w:t>
-      </w:r>
-    </w:p>
-    <w:p>
-      <w:pPr>
+        <w:t>A programme can buy more sequencing, more time points, and more replicates, and still be unable to say which forecasting design is better. Averages hide the failure that matters. A model can post a strong mean error and still miss often enough that anyone acting on it is wrong at the moment of decision. This artifact uses tens of millions of US dollars only as an illustrative programme scale. At that scale, waiting for field data can leave the design locked before the comparison is resolved. This is a design problem, and it is cheapest to solve before anyone collects a sample.</w:t>
+      </w:r>
+    </w:p>
+    <w:p>
+      <w:pPr>
+        <w:keepNext/>
         <w:pBdr>
           <w:top w:val="single" w:color="D7DEE2" w:sz="6" w:space="6"/>
         </w:pBdr>
@@ -298,7 +300,7 @@
           <w:sz w:val="19"/>
           <w:szCs w:val="19"/>
         </w:rPr>
-        <w:t xml:space="preserve">The engine builds a simulated world where the true evolutionary outcome is fixed by construction, then hides it. Competing measurement designs, each with a defined budget and data package, produce forecasts and deposit them into a sealed record. Only then does the engine reveal the truth and score every deposit on the same footing, covering accuracy, calibration of stated uncertainty, and whether the ranking between designs survives perturbation.</w:t>
+        <w:t>The engine builds a simulated world where the true evolutionary outcome is fixed by construction, then hides it. Competing measurement designs, each with a registered modeled-resource allowance and data package, produce forecasts and deposit them into a sealed record. Only then does the engine reveal the truth and score every deposit on the same footing, covering accuracy, calibration of stated uncertainty, and whether the ranking between designs survives perturbation.</w:t>
       </w:r>
     </w:p>
     <w:p>
@@ -312,11 +314,12 @@
           <w:sz w:val="19"/>
           <w:szCs w:val="19"/>
         </w:rPr>
-        <w:t xml:space="preserve">It returns three answers money cannot buy back later. Whether rival designs can be told apart at the sample size a programme can actually afford. Which added measurement buys identifiability and which is expensive ornament. And when the honest reading is not ready, redesign. A round that ends in redesign has done its job.</w:t>
-      </w:r>
-    </w:p>
-    <w:p>
-      <w:pPr>
+        <w:t>It returns three answers money cannot buy back later. Whether rival designs can be told apart at the sample size a programme can afford. Which added measurement makes those designs distinguishable, a property called identifiability. And when the evidence says the design is not ready, redesign. A round that ends in redesign has done its job.</w:t>
+      </w:r>
+    </w:p>
+    <w:p>
+      <w:pPr>
+        <w:keepNext/>
         <w:pBdr>
           <w:top w:val="single" w:color="D7DEE2" w:sz="6" w:space="6"/>
         </w:pBdr>
@@ -345,7 +348,7 @@
           <w:sz w:val="19"/>
           <w:szCs w:val="19"/>
         </w:rPr>
-        <w:t xml:space="preserve">The frozen round completed 5,600 of 5,600 simulated runs with no failures, and every prediction was deposited before reveal. The richest measurement track improved mean accuracy 47.5 percent over the simplest baseline, aggregated across 35 contexts. Its nominal 90 percent interval covered only 80 percent of held-out values. Adding a feedback track on top of genome plus phenome bought nothing. Zero of 60 forward-looking cells reached the 50 percent combined gate. Zero of 80 were robust. Zero of 120 experiment plans were robustly best. The positive control recovered a planted signal at +17.0 percent, and the matched adverse control came back empty at -9.2 percent. Both are marker-encoded software controls.</w:t>
+        <w:t>The frozen round completed 5,600 of 5,600 simulated runs with no failures. The genome-plus-phenome track, which combines genetic information with measured traits, improved mean accuracy 47.5 percent over the pedigree baseline, aggregated across 35 contexts. Its nominal 90 percent interval covered only 80 percent of held-out values. Adding a feedback track on top of genome plus phenome bought nothing. Zero of 60 forward-looking cells reached the 50 percent combined gate. One of 80 cells reached it, a day-90 nowcast at 52.5 percent. Zero of 80 were robust. Zero of 120 experiment plans were robustly best. The positive control recovered a planted signal at +17.0 percent, and the matched adverse control came back empty at -9.2 percent. Both are marker-encoded software controls.</w:t>
       </w:r>
     </w:p>
     <w:p>
@@ -365,11 +368,12 @@
           <w:sz w:val="19"/>
           <w:szCs w:val="19"/>
         </w:rPr>
-        <w:t xml:space="preserve">That is a clean run reporting do not scale yet. Buying that verdict for the price of compute is the point.</w:t>
-      </w:r>
-    </w:p>
-    <w:p>
-      <w:pPr>
+        <w:t>The clean run gives a clear instruction. Do not scale this design yet.</w:t>
+      </w:r>
+    </w:p>
+    <w:p>
+      <w:pPr>
+        <w:keepNext/>
         <w:pBdr>
           <w:top w:val="single" w:color="D7DEE2" w:sz="6" w:space="6"/>
         </w:pBdr>
@@ -384,7 +388,7 @@
           <w:sz w:val="23"/>
           <w:szCs w:val="23"/>
         </w:rPr>
-        <w:t xml:space="preserve">Why this is decision-grade</w:t>
+        <w:t>Why this result can support a decision</w:t>
       </w:r>
     </w:p>
     <w:p>
@@ -398,7 +402,7 @@
           <w:sz w:val="19"/>
           <w:szCs w:val="19"/>
         </w:rPr>
-        <w:t xml:space="preserve">Every number traces to a run identifier, a configuration, and a deposit timestamp. No code path that writes a forecast can also read the truth. Reported artifacts are lookup-only, so each figure is a retrieval from a frozen record rather than a fresh computation with fresh degrees of freedom. Controls are allowed to come back empty, and one did, which is direct evidence the scoring does not manufacture signal.</w:t>
+        <w:t>Every displayed statistic in this artifact points to a frozen source row and a recorded SHA-256 fingerprint. The browser only retrieves those rows. It does not write forecasts, fit models, run simulations, or access latent truth. Controls can return an adverse result, and one did. That shows the published workflow does not force a favorable signal.</w:t>
       </w:r>
     </w:p>
     <w:p>
@@ -412,11 +416,12 @@
           <w:sz w:val="19"/>
           <w:szCs w:val="19"/>
         </w:rPr>
-        <w:t xml:space="preserve">On engine direction, SLiM 5.2 is the registered trajectory engine for this round. The harness is engine-agnostic and other evolutionary simulators are under evaluation. Ecological network dynamics are being developed in a population context, so eco-evolutionary feedback is represented rather than assumed away.</w:t>
-      </w:r>
-    </w:p>
-    <w:p>
-      <w:pPr>
+        <w:t>SLiM 5.2 is the registered trajectory engine for this round. The surrounding harness is engine-agnostic, and other evolutionary simulators are under evaluation. Ecological-network work in a population context is a development direction for later rounds. This round does not claim that capability.</w:t>
+      </w:r>
+    </w:p>
+    <w:p>
+      <w:pPr>
+        <w:keepNext/>
         <w:pBdr>
           <w:top w:val="single" w:color="D7DEE2" w:sz="6" w:space="6"/>
         </w:pBdr>
@@ -445,7 +450,7 @@
           <w:sz w:val="19"/>
           <w:szCs w:val="19"/>
         </w:rPr>
-        <w:t xml:space="preserve">The wind tunnel is a cheap front stage sitting ahead of the stages that cost field seasons, facilities, and staff. Before a portfolio commits several teams to a shared measurement standard, the wind tunnel can show whether that standard would let anyone tell the teams apart on results.</w:t>
+        <w:t>The wind tunnel is an early design stage ahead of the stages that cost field seasons, facilities, and staff. Before a programme commits several teams to a shared measurement standard, the wind tunnel can show whether that standard would let anyone tell their forecasts apart.</w:t>
       </w:r>
     </w:p>
     <w:p>
@@ -459,11 +464,12 @@
           <w:sz w:val="19"/>
           <w:szCs w:val="19"/>
         </w:rPr>
-        <w:t xml:space="preserve">It also prices measurement. When a data layer moves accuracy without moving identifiability, funding it becomes a choice made with the number in hand. For keystone-leverage work, the same loop asks whether an intervention on one organism produces a change the programme can forecast in advance or only recognise afterwards. And because every design is scored against one held-out challenge under one protocol, work from different groups arrives comparable rather than merely adjacent.</w:t>
-      </w:r>
-    </w:p>
-    <w:p>
-      <w:pPr>
+        <w:t>It compares modeled resource use with forecast value. When a data layer changes accuracy without changing identifiability, the team can see that tradeoff before committing it to a protocol. Future keystone-centered work would use the same loop to ask whether a change involving one influential organism can be forecast in advance. Every design would face the same held-out challenge under one protocol, making results directly comparable.</w:t>
+      </w:r>
+    </w:p>
+    <w:p>
+      <w:pPr>
+        <w:keepNext/>
         <w:pBdr>
           <w:top w:val="single" w:color="D7DEE2" w:sz="6" w:space="6"/>
         </w:pBdr>
@@ -492,11 +498,12 @@
           <w:sz w:val="19"/>
           <w:szCs w:val="19"/>
         </w:rPr>
-        <w:t xml:space="preserve">One candidate keystone organism. One spendable budget. One held-out challenge. Rehearse the design in the wind tunnel, then run the smallest real round that can estimate calibration and forecast accuracy under an independent reveal. Only after that round clears every gate does the design stage up to a network of interacting species around the keystone, adding genetic backgrounds, controlled conditions, spatial structure, and small controlled model ecosystems. Molecular layers expand last, after the cheaper layers have earned their place.</w:t>
-      </w:r>
-    </w:p>
-    <w:p>
-      <w:pPr>
+        <w:t>One candidate keystone organism. One spendable budget in US dollars. One held-out challenge. Rehearse the design in the wind tunnel, then run the smallest real round that can estimate calibration and forecast accuracy under an independent reveal. If that round clears every gate, a later design could stage toward a network of interacting species around the keystone, adding genetic backgrounds, controlled conditions, spatial structure, and small controlled model ecosystems. Molecular layers expand last, after the cheaper layers have earned their place.</w:t>
+      </w:r>
+    </w:p>
+    <w:p>
+      <w:pPr>
+        <w:keepNext/>
         <w:pBdr>
           <w:top w:val="single" w:color="D7DEE2" w:sz="6" w:space="6"/>
         </w:pBdr>
@@ -695,74 +702,6 @@
         </w:tc>
       </w:tr>
     </w:tbl>
-    <w:p>
-      <w:pPr>
-        <w:pBdr>
-          <w:top w:val="single" w:color="D7DEE2" w:sz="6" w:space="8"/>
-        </w:pBdr>
-        <w:spacing w:after="0" w:before="170"/>
-      </w:pPr>
-      <w:r>
-        <w:rPr>
-          <w:rFonts w:ascii="IBM Plex Sans" w:cs="IBM Plex Sans" w:eastAsia="IBM Plex Sans" w:hAnsi="IBM Plex Sans"/>
-          <w:b/>
-          <w:bCs/>
-          <w:color w:val="0E2A47"/>
-          <w:sz w:val="18"/>
-          <w:szCs w:val="18"/>
-        </w:rPr>
-        <w:t xml:space="preserve">Built by Jay Gutierrez, PhD</w:t>
-      </w:r>
-    </w:p>
-    <w:p>
-      <w:pPr>
-        <w:spacing w:after="40"/>
-      </w:pPr>
-      <w:r>
-        <w:rPr>
-          <w:rFonts w:ascii="IBM Plex Sans" w:cs="IBM Plex Sans" w:eastAsia="IBM Plex Sans" w:hAnsi="IBM Plex Sans"/>
-          <w:color w:val="5C6E78"/>
-          <w:sz w:val="17"/>
-          <w:szCs w:val="17"/>
-        </w:rPr>
-        <w:t xml:space="preserve">Ecological network science, graph intelligence, and nature-finance translation, publishing the work defining the ecological structural-risk category.</w:t>
-      </w:r>
-    </w:p>
-    <w:p>
-      <w:hyperlink w:history="1" r:id="rIdvnblaqu1bkqdz0cxxwqq1">
-        <w:r>
-          <w:rPr>
-            <w:rFonts w:ascii="IBM Plex Mono" w:cs="IBM Plex Mono" w:eastAsia="IBM Plex Mono" w:hAnsi="IBM Plex Mono"/>
-            <w:color w:val="0E7A70"/>
-            <w:sz w:val="16"/>
-            <w:szCs w:val="16"/>
-            <w:u w:val="single"/>
-          </w:rPr>
-          <w:t xml:space="preserve">jg@graphoflife.com</w:t>
-        </w:r>
-      </w:hyperlink>
-      <w:r>
-        <w:rPr>
-          <w:rFonts w:ascii="IBM Plex Mono" w:cs="IBM Plex Mono" w:eastAsia="IBM Plex Mono" w:hAnsi="IBM Plex Mono"/>
-          <w:color w:val="5C6E78"/>
-          <w:sz w:val="16"/>
-          <w:szCs w:val="16"/>
-        </w:rPr>
-        <w:t xml:space="preserve">   ·   </w:t>
-      </w:r>
-      <w:hyperlink w:history="1" r:id="rIdjoabqnutnjy9d8wycgquv">
-        <w:r>
-          <w:rPr>
-            <w:rFonts w:ascii="IBM Plex Mono" w:cs="IBM Plex Mono" w:eastAsia="IBM Plex Mono" w:hAnsi="IBM Plex Mono"/>
-            <w:color w:val="0E7A70"/>
-            <w:sz w:val="16"/>
-            <w:szCs w:val="16"/>
-            <w:u w:val="single"/>
-          </w:rPr>
-          <w:t xml:space="preserve">biome-translator.emergent.host</w:t>
-        </w:r>
-      </w:hyperlink>
-    </w:p>
     <w:sectPr>
       <w:pgSz w:w="12240" w:h="15840" w:orient="portrait"/>
       <w:pgMar w:top="1008" w:right="1224" w:bottom="863" w:left="1224" w:header="708" w:footer="708" w:gutter="0"/>

</xml_diff>

<commit_message>
Deep-audit story and add frozen trajectory scene
</commit_message>
<xml_diff>
--- a/EvoForecast-decision-brief.docx
+++ b/EvoForecast-decision-brief.docx
@@ -16,7 +16,7 @@
           <w:sz w:val="17"/>
           <w:szCs w:val="17"/>
         </w:rPr>
-        <w:t xml:space="preserve">GRAPH OF LIFE</w:t>
+        <w:t>GRAPH OF LIFE   |   EVOFORECAST                                        DECISION BRIEF · 21 JUL 2026</w:t>
       </w:r>
       <w:r>
         <w:rPr>
@@ -25,7 +25,6 @@
           <w:sz w:val="17"/>
           <w:szCs w:val="17"/>
         </w:rPr>
-        <w:t xml:space="preserve">   |   </w:t>
       </w:r>
       <w:r>
         <w:rPr>
@@ -37,7 +36,6 @@
           <w:sz w:val="17"/>
           <w:szCs w:val="17"/>
         </w:rPr>
-        <w:t xml:space="preserve">EVOFORECAST</w:t>
       </w:r>
       <w:r>
         <w:rPr>
@@ -46,7 +44,6 @@
           <w:sz w:val="13"/>
           <w:szCs w:val="13"/>
         </w:rPr>
-        <w:t xml:space="preserve">                                        DECISION BRIEF · 20 JUL 2026</w:t>
       </w:r>
     </w:p>
     <w:p>
@@ -132,18 +129,9 @@
                 <w:sz w:val="26"/>
                 <w:szCs w:val="26"/>
               </w:rPr>
-              <w:t xml:space="preserve">5,600 / 5,600</w:t>
-            </w:r>
-          </w:p>
-          <w:p>
-            <w:r>
-              <w:rPr>
-                <w:rFonts w:ascii="IBM Plex Sans" w:cs="IBM Plex Sans" w:eastAsia="IBM Plex Sans" w:hAnsi="IBM Plex Sans"/>
-                <w:color w:val="EAF1F1"/>
-                <w:sz w:val="14"/>
-                <w:szCs w:val="14"/>
-              </w:rPr>
-              <w:t xml:space="preserve">simulated runs completed, none failed</w:t>
+              <w:t>5,600 / 5,600</w:t>
+              <w:br/>
+              <w:t>simulated runs completed successfully</w:t>
             </w:r>
           </w:p>
         </w:tc>
@@ -266,7 +254,7 @@
           <w:sz w:val="19"/>
           <w:szCs w:val="19"/>
         </w:rPr>
-        <w:t>A programme can buy more sequencing, more time points, and more replicates, and still be unable to say which forecasting design is better. Averages hide the failure that matters. A model can post a strong mean error and still miss often enough that anyone acting on it is wrong at the moment of decision. This artifact uses tens of millions of US dollars only as an illustrative programme scale. At that scale, waiting for field data can leave the design locked before the comparison is resolved. This is a design problem, and it is cheapest to solve before anyone collects a sample.</w:t>
+        <w:t>A programme can buy more sequencing, more time points, and more replicates while leaving two forecasting designs indistinguishable. Averages hide the failure that matters. A model can post a strong mean error and still miss often enough to fail at the moment of decision. This artifact uses tens of millions of US dollars as illustrative programme scale. At that scale, waiting for field data can lock the design before the comparison is resolved. This design problem is cheapest to solve before anyone collects a sample.</w:t>
       </w:r>
     </w:p>
     <w:p>
@@ -300,7 +288,7 @@
           <w:sz w:val="19"/>
           <w:szCs w:val="19"/>
         </w:rPr>
-        <w:t>The engine builds a simulated world where the true evolutionary outcome is fixed by construction, then hides it. Competing measurement designs, each with a registered modeled-resource allowance and data package, produce forecasts and deposit them into a sealed record. Only then does the engine reveal the truth and score every deposit on the same footing, covering accuracy, calibration of stated uncertainty, and whether the ranking between designs survives perturbation.</w:t>
+        <w:t>The engine builds a simulated world where the true evolutionary outcome is fixed by construction, then seals it. Competing measurement designs receive registered data packages and modeled-resource allowances. They deposit forecasts before reveal. The harness then scores every deposit on the same footing, covering accuracy, calibration of stated uncertainty, and whether design rankings survive perturbation.</w:t>
       </w:r>
     </w:p>
     <w:p>
@@ -314,7 +302,7 @@
           <w:sz w:val="19"/>
           <w:szCs w:val="19"/>
         </w:rPr>
-        <w:t>It returns three answers money cannot buy back later. Whether rival designs can be told apart at the sample size a programme can afford. Which added measurement makes those designs distinguishable, a property called identifiability. And when the evidence says the design is not ready, redesign. A round that ends in redesign has done its job.</w:t>
+        <w:t>It returns three answers that become irrecoverable once collection begins. It shows whether rival designs can be told apart at an affordable sample size. It reveals which added measurement makes those designs distinguishable, a property called identifiability. It also returns a redesign decision when the evidence remains weak. A round that ends in redesign has done its job.</w:t>
       </w:r>
     </w:p>
     <w:p>
@@ -348,7 +336,7 @@
           <w:sz w:val="19"/>
           <w:szCs w:val="19"/>
         </w:rPr>
-        <w:t>The frozen round completed 5,600 of 5,600 simulated runs with no failures. The genome-plus-phenome track, which combines genetic information with measured traits, improved mean accuracy 47.5 percent over the pedigree baseline, aggregated across 35 contexts. Its nominal 90 percent interval covered only 80 percent of held-out values. Adding a feedback track on top of genome plus phenome bought nothing. Zero of 60 forward-looking cells reached the 50 percent combined gate. One of 80 cells reached it, a day-90 nowcast at 52.5 percent. Zero of 80 were robust. Zero of 120 experiment plans were robustly best. The positive control recovered a planted signal at +17.0 percent, and the matched adverse control came back empty at -9.2 percent. Both are marker-encoded software controls.</w:t>
+        <w:t>The frozen round completed 5,600 of 5,600 simulated runs successfully. The genome-plus-phenome track, which combines genetic information with measured traits, improved mean accuracy by 47.5 percent over the pedigree baseline, aggregated across 35 contexts. Its nominal 90 percent interval covered 80 percent of held-out values. The feedback track added 0.0 percent beyond genome plus phenome. Zero of 60 forward-looking cells reached the 50 percent combined gate. One of 80 cells reached it, a day-90 nowcast at 52.5 percent. Zero of 80 were robust. Zero of 120 experiment plans were robustly best. The favorable control returned +17.0 percent and the matched adverse control returned -9.2 percent. Both are marker-encoded software controls.</w:t>
       </w:r>
     </w:p>
     <w:p>
@@ -368,7 +356,7 @@
           <w:sz w:val="19"/>
           <w:szCs w:val="19"/>
         </w:rPr>
-        <w:t>The clean run gives a clear instruction. Do not scale this design yet.</w:t>
+        <w:t>The clean run gives a clear instruction. Delay scale-up and design a stronger test.</w:t>
       </w:r>
     </w:p>
     <w:p>
@@ -402,7 +390,7 @@
           <w:sz w:val="19"/>
           <w:szCs w:val="19"/>
         </w:rPr>
-        <w:t>Every displayed statistic in this artifact points to a frozen source row and a recorded SHA-256 fingerprint. The browser only retrieves those rows. It does not write forecasts, fit models, run simulations, or access latent truth. Controls can return an adverse result, and one did. That shows the published workflow does not force a favorable signal.</w:t>
+        <w:t>Every displayed statistic points to a frozen source row and a recorded SHA-256 fingerprint. The browser is a lookup surface. Forecasting, model fitting, simulation, scoring, and access to latent truth stay upstream. The favorable and adverse controls move in opposite directions, showing that the workflow can expose failure.</w:t>
       </w:r>
     </w:p>
     <w:p>
@@ -416,7 +404,7 @@
           <w:sz w:val="19"/>
           <w:szCs w:val="19"/>
         </w:rPr>
-        <w:t>SLiM 5.2 is the registered trajectory engine for this round. The surrounding harness is engine-agnostic, and other evolutionary simulators are under evaluation. Ecological-network work in a population context is a development direction for later rounds. This round does not claim that capability.</w:t>
+        <w:t>SLiM 5.2 is the registered trajectory engine for this round. The surrounding harness is engine-agnostic, and other evolutionary simulators are under evaluation. Ecological network work in a population context is a development direction for later rounds.</w:t>
       </w:r>
     </w:p>
     <w:p>
@@ -450,7 +438,7 @@
           <w:sz w:val="19"/>
           <w:szCs w:val="19"/>
         </w:rPr>
-        <w:t>The wind tunnel is an early design stage ahead of the stages that cost field seasons, facilities, and staff. Before a programme commits several teams to a shared measurement standard, the wind tunnel can show whether that standard would let anyone tell their forecasts apart.</w:t>
+        <w:t>The wind tunnel is an early design stage ahead of field seasons, facilities, and staff. Before several teams commit to a shared measurement standard, it can show whether that standard would let them distinguish their forecasts.</w:t>
       </w:r>
     </w:p>
     <w:p>
@@ -464,7 +452,7 @@
           <w:sz w:val="19"/>
           <w:szCs w:val="19"/>
         </w:rPr>
-        <w:t>It compares modeled resource use with forecast value. When a data layer changes accuracy without changing identifiability, the team can see that tradeoff before committing it to a protocol. Future keystone-centered work would use the same loop to ask whether a change involving one influential organism can be forecast in advance. Every design would face the same held-out challenge under one protocol, making results directly comparable.</w:t>
+        <w:t>A new interactive view exposes all 32 registered trajectories in one Study E persistence cell. Each vessel starts with the same 80 grazers and eight immutable founders. All retain grazers through day 90, while standing selection produces different population and founder histories. That distribution makes the forecasting problem tangible. The broader instrument then compares modeled resource use with forecast value and shows when a data layer changes accuracy, identifiability, or both.</w:t>
       </w:r>
     </w:p>
     <w:p>
@@ -498,7 +486,7 @@
           <w:sz w:val="19"/>
           <w:szCs w:val="19"/>
         </w:rPr>
-        <w:t>One candidate keystone organism. One spendable budget in US dollars. One held-out challenge. Rehearse the design in the wind tunnel, then run the smallest real round that can estimate calibration and forecast accuracy under an independent reveal. If that round clears every gate, a later design could stage toward a network of interacting species around the keystone, adding genetic backgrounds, controlled conditions, spatial structure, and small controlled model ecosystems. Molecular layers expand last, after the cheaper layers have earned their place.</w:t>
+        <w:t>One candidate keystone organism. One contained stressor. One spendable budget in US dollars. One outcome sealed until scoring. Rehearse the design, then run the smallest real round that can estimate calibration and forecast accuracy under an independent reveal. A later contained round can test whether a targeted intervention improves resilience. Interacting species, spatial structure, small model ecosystems, and molecular layers expand after the forecast layer earns trust.</w:t>
       </w:r>
     </w:p>
     <w:p>
@@ -687,7 +675,7 @@
                 <w:sz w:val="17"/>
                 <w:szCs w:val="17"/>
               </w:rPr>
-              <w:t xml:space="preserve">Claim boundary. </w:t>
+              <w:t>Claim boundary. All evidence is synthetic and within-model. Real-organism forecast skill, real DNA predictive value, out-of-distribution transfer, and intervention efficacy await empirical testing. Independent review precedes any operational, partnership, or funding claim.</w:t>
             </w:r>
             <w:r>
               <w:rPr>
@@ -696,7 +684,44 @@
                 <w:sz w:val="17"/>
                 <w:szCs w:val="17"/>
               </w:rPr>
-              <w:t xml:space="preserve">All evidence here is synthetic and within-model. It shows no real-organism forecast skill, no real DNA predictive value, and no out-of-distribution transfer, and it implies no endorsement, partnership, or funding relationship.</w:t>
+            </w:r>
+          </w:p>
+        </w:tc>
+      </w:tr>
+    </w:tbl>
+    <w:tbl>
+      <w:tblPr>
+        <w:tblW w:type="auto" w:w="0"/>
+        <w:tblLook w:firstColumn="1" w:firstRow="1" w:lastColumn="0" w:lastRow="0" w:noHBand="0" w:noVBand="1" w:val="04A0"/>
+      </w:tblPr>
+      <w:tblGrid>
+        <w:gridCol w:w="4896"/>
+        <w:gridCol w:w="4896"/>
+      </w:tblGrid>
+      <w:tr>
+        <w:tc>
+          <w:tcPr>
+            <w:tcW w:type="dxa" w:w="4896"/>
+          </w:tcPr>
+          <w:p>
+            <w:r>
+              <w:t>Jay Gutierrez, PhD</w:t>
+              <w:br/>
+              <w:t>Built through GraphOfLife across ecological network science, graph intelligence, evolutionary forecasting, nature-finance translation, and structural-risk publishing.</w:t>
+            </w:r>
+          </w:p>
+        </w:tc>
+        <w:tc>
+          <w:tcPr>
+            <w:tcW w:type="dxa" w:w="4896"/>
+          </w:tcPr>
+          <w:p>
+            <w:r>
+              <w:t>CONTACT</w:t>
+              <w:br/>
+              <w:t>jg@graphoflife.com</w:t>
+              <w:br/>
+              <w:t>biome-translator.emergent.host</w:t>
             </w:r>
           </w:p>
         </w:tc>

</xml_diff>